<commit_message>
Adição de nova label para transporte e biblioteca docxtpl
</commit_message>
<xml_diff>
--- a/app/docx_templates/ASSIDUIDADE.docx
+++ b/app/docx_templates/ASSIDUIDADE.docx
@@ -110,7 +110,7 @@
           </mc:Choice>
           <mc:Fallback>
             <w:pict>
-              <v:shape w14:anchorId="5BD2BE03" id="Graphic 1" o:spid="_x0000_s1026" style="position:absolute;margin-left:106.9pt;margin-top:-27.6pt;width:473.55pt;height:.5pt;z-index:15728640;visibility:visible;mso-wrap-style:square;mso-wrap-distance-left:0;mso-wrap-distance-top:0;mso-wrap-distance-right:0;mso-wrap-distance-bottom:0;mso-position-horizontal:absolute;mso-position-horizontal-relative:page;mso-position-vertical:absolute;mso-position-vertical-relative:text;v-text-anchor:top" coordsize="6014085,6350" o:gfxdata="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" path="m6013703,6096l,6096,,,6013703,r,6096xe" fillcolor="black" stroked="f">
+              <v:shape w14:anchorId="14E50088" id="Graphic 1" o:spid="_x0000_s1026" style="position:absolute;margin-left:106.9pt;margin-top:-27.6pt;width:473.55pt;height:.5pt;z-index:15728640;visibility:visible;mso-wrap-style:square;mso-wrap-distance-left:0;mso-wrap-distance-top:0;mso-wrap-distance-right:0;mso-wrap-distance-bottom:0;mso-position-horizontal:absolute;mso-position-horizontal-relative:page;mso-position-vertical:absolute;mso-position-vertical-relative:text;v-text-anchor:top" coordsize="6014085,6350" o:gfxdata="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" path="m6013703,6096l,6096,,,6013703,r,6096xe" fillcolor="black" stroked="f">
                 <v:path arrowok="t"/>
                 <w10:wrap anchorx="page"/>
               </v:shape>
@@ -455,7 +455,13 @@
         <w:t xml:space="preserve"> </w:t>
       </w:r>
       <w:r>
-        <w:t>&lt;mes_id&gt;</w:t>
+        <w:t>{{</w:t>
+      </w:r>
+      <w:r>
+        <w:t>mes_id</w:t>
+      </w:r>
+      <w:r>
+        <w:t>}}</w:t>
       </w:r>
       <w:r>
         <w:rPr>
@@ -515,7 +521,19 @@
         <w:rPr>
           <w:spacing w:val="-2"/>
         </w:rPr>
-        <w:t>&lt;name_id&gt;</w:t>
+        <w:t>{{</w:t>
+      </w:r>
+      <w:r>
+        <w:rPr>
+          <w:spacing w:val="-2"/>
+        </w:rPr>
+        <w:t>name_id</w:t>
+      </w:r>
+      <w:r>
+        <w:rPr>
+          <w:spacing w:val="-2"/>
+        </w:rPr>
+        <w:t>}}</w:t>
       </w:r>
     </w:p>
     <w:p>
@@ -658,7 +676,19 @@
         <w:rPr>
           <w:rFonts w:ascii="Arial MT"/>
         </w:rPr>
-        <w:t>&lt;cpf_id&gt;</w:t>
+        <w:t>{{</w:t>
+      </w:r>
+      <w:r>
+        <w:rPr>
+          <w:rFonts w:ascii="Arial MT"/>
+        </w:rPr>
+        <w:t>cpf_id</w:t>
+      </w:r>
+      <w:r>
+        <w:rPr>
+          <w:rFonts w:ascii="Arial MT"/>
+        </w:rPr>
+        <w:t>}}</w:t>
       </w:r>
     </w:p>
     <w:p>
@@ -714,7 +744,13 @@
         <w:t xml:space="preserve"> </w:t>
       </w:r>
       <w:r>
-        <w:t>&lt;empresa_id&gt;</w:t>
+        <w:t>{{</w:t>
+      </w:r>
+      <w:r>
+        <w:t>empresa_id</w:t>
+      </w:r>
+      <w:r>
+        <w:t>}}</w:t>
       </w:r>
     </w:p>
     <w:p>
@@ -773,7 +809,13 @@
         <w:t xml:space="preserve"> </w:t>
       </w:r>
       <w:r>
-        <w:t>&lt;cnpj_id&gt;</w:t>
+        <w:t>{{</w:t>
+      </w:r>
+      <w:r>
+        <w:t>cnpj_id</w:t>
+      </w:r>
+      <w:r>
+        <w:t>}}</w:t>
       </w:r>
     </w:p>
     <w:p>

</xml_diff>